<commit_message>
feat: Adicionar polÃ­ticas RH e DP com navegaÃ§Ã£o integrada
- Adicionar pasta 'Politicas RH e DP' com polÃ­ticas de FÃ©rias e Desligamento
- Implementar busca com suporte a acentos (fÃ©rias/ferias, rescisÃ£o/rescisao)
- Melhorar navegaÃ§Ã£o entre departamentos com hash URLs (#rh-dp)
- Adicionar downloads de PDFs para todas as polÃ­ticas
- Corrigir alinhamento de checkboxes no Checklist de Desligamento
- Atualizar texto para incluir 'lÃ­der imediato' no processo Bitrix
- Criar CSS especÃ­fico para cards de departamentos
- Remover pÃ¡gina intermediÃ¡ria desnecessÃ¡ria
- Integrar conteÃºdo completo das polÃ­ticas de RH
</commit_message>
<xml_diff>
--- a/Fluxo emissão nota fiscal PJ/Fluxo de Pagamento – Prestadores de Serviço PJ.docx
+++ b/Fluxo emissão nota fiscal PJ/Fluxo de Pagamento – Prestadores de Serviço PJ.docx
@@ -990,7 +990,15 @@
         </w:numPr>
       </w:pPr>
       <w:r>
-        <w:t>Recebe todas as NFs e confere com a planilha do RH/DP.</w:t>
+        <w:t xml:space="preserve">Recebe todas as </w:t>
+      </w:r>
+      <w:proofErr w:type="spellStart"/>
+      <w:r>
+        <w:t>NFs</w:t>
+      </w:r>
+      <w:proofErr w:type="spellEnd"/>
+      <w:r>
+        <w:t xml:space="preserve"> e confere com a planilha do RH/DP.</w:t>
       </w:r>
     </w:p>
     <w:p>
@@ -1013,6 +1021,7 @@
       <w:r>
         <w:t xml:space="preserve"> → lança no </w:t>
       </w:r>
+      <w:proofErr w:type="spellStart"/>
       <w:r>
         <w:rPr>
           <w:b/>
@@ -1020,6 +1029,7 @@
         </w:rPr>
         <w:t>Omie</w:t>
       </w:r>
+      <w:proofErr w:type="spellEnd"/>
       <w:r>
         <w:t xml:space="preserve"> e agenda o pagamento no banco.</w:t>
       </w:r>
@@ -1147,10 +1157,10 @@
           <w:noProof/>
         </w:rPr>
         <w:drawing>
-          <wp:inline distT="0" distB="0" distL="0" distR="0" wp14:anchorId="640F71A8" wp14:editId="2AC6AC75">
-            <wp:extent cx="5391150" cy="7025005"/>
-            <wp:effectExtent l="0" t="0" r="0" b="4445"/>
-            <wp:docPr id="1093657418" name="Imagem 1"/>
+          <wp:inline distT="0" distB="0" distL="0" distR="0" wp14:anchorId="11FA9E83" wp14:editId="1FFE3D51">
+            <wp:extent cx="5400040" cy="7638415"/>
+            <wp:effectExtent l="0" t="0" r="0" b="635"/>
+            <wp:docPr id="1417688610" name="Imagem 2" descr="Diagrama&#10;&#10;O conteúdo gerado por IA pode estar incorreto."/>
             <wp:cNvGraphicFramePr>
               <a:graphicFrameLocks xmlns:a="http://schemas.openxmlformats.org/drawingml/2006/main" noChangeAspect="1"/>
             </wp:cNvGraphicFramePr>
@@ -1158,36 +1168,29 @@
               <a:graphicData uri="http://schemas.openxmlformats.org/drawingml/2006/picture">
                 <pic:pic xmlns:pic="http://schemas.openxmlformats.org/drawingml/2006/picture">
                   <pic:nvPicPr>
-                    <pic:cNvPr id="0" name="Picture 33"/>
-                    <pic:cNvPicPr>
-                      <a:picLocks noChangeAspect="1" noChangeArrowheads="1"/>
-                    </pic:cNvPicPr>
+                    <pic:cNvPr id="1417688610" name="Imagem 2" descr="Diagrama&#10;&#10;O conteúdo gerado por IA pode estar incorreto."/>
+                    <pic:cNvPicPr/>
                   </pic:nvPicPr>
                   <pic:blipFill>
-                    <a:blip r:embed="rId8" cstate="print">
+                    <a:blip r:embed="rId8">
                       <a:extLst>
                         <a:ext uri="{28A0092B-C50C-407E-A947-70E740481C1C}">
                           <a14:useLocalDpi xmlns:a14="http://schemas.microsoft.com/office/drawing/2010/main" val="0"/>
                         </a:ext>
                       </a:extLst>
                     </a:blip>
-                    <a:srcRect/>
                     <a:stretch>
                       <a:fillRect/>
                     </a:stretch>
                   </pic:blipFill>
-                  <pic:spPr bwMode="auto">
+                  <pic:spPr>
                     <a:xfrm>
                       <a:off x="0" y="0"/>
-                      <a:ext cx="5391150" cy="7025005"/>
+                      <a:ext cx="5400040" cy="7638415"/>
                     </a:xfrm>
                     <a:prstGeom prst="rect">
                       <a:avLst/>
                     </a:prstGeom>
-                    <a:noFill/>
-                    <a:ln>
-                      <a:noFill/>
-                    </a:ln>
                   </pic:spPr>
                 </pic:pic>
               </a:graphicData>

</xml_diff>